<commit_message>
Spanish version up to date, removed crop importance section
</commit_message>
<xml_diff>
--- a/WilliamHolt_CV.docx
+++ b/WilliamHolt_CV.docx
@@ -158,7 +158,7 @@
           <w:szCs w:val="20"/>
           <w:rtl w:val="0"/>
         </w:rPr>
-        <w:t xml:space="preserve">NumPy, Pandas, Power BI, Tableau, Snowflake, MySQL, Spark, Athena, Git, Excel, Tidyverse</w:t>
+        <w:t xml:space="preserve">NumPy, Pandas, Power BI, Snowflake, MySQL, Spark, Athena, Git, Excel, Tidyverse</w:t>
       </w:r>
       <w:r>
         <w:rPr>
@@ -189,7 +189,7 @@
           <w:szCs w:val="20"/>
           <w:rtl w:val="0"/>
         </w:rPr>
-        <w:t xml:space="preserve">Statistical Analysis, Regression, GIS, Data Visualisation, Big Data, Hypothesis Testing, Time-Series Analysis</w:t>
+        <w:t xml:space="preserve">Statistical Analysis, Regression, Data Visualisation, Big Data, Hypothesis Testing, Time-Series Analysis</w:t>
       </w:r>
       <w:r>
         <w:rPr>
@@ -660,7 +660,7 @@
           <w:vertAlign w:val="baseline"/>
           <w:rtl w:val="0"/>
         </w:rPr>
-        <w:t xml:space="preserve">Led migration of Qlik dashboards to Tableau by documenting existing logic, enabling a streamlined and consistent transition process.</w:t>
+        <w:t xml:space="preserve">L migration of Qlik dashboards to Tableau by documenting existing logic, enabling a streamlined and consistent transition process.</w:t>
       </w:r>
       <w:r>
         <w:rPr>
@@ -1212,47 +1212,6 @@
           <w:rtl w:val="0"/>
         </w:rPr>
         <w:t xml:space="preserve">Presented findings to faculty in a detailed dissemination document featuring complex visualisations and statistical outputs.</w:t>
-      </w:r>
-      <w:r>
-        <w:rPr>
-          <w:rtl w:val="0"/>
-        </w:rPr>
-      </w:r>
-    </w:p>
-    <w:p>
-      <w:pPr>
-        <w:spacing w:after="40" w:before="120" w:lineRule="auto"/>
-        <w:rPr>
-          <w:rFonts w:ascii="Arial" w:cs="Arial" w:eastAsia="Arial" w:hAnsi="Arial"/>
-          <w:b w:val="0"/>
-          <w:bCs w:val="0"/>
-          <w:i w:val="0"/>
-          <w:iCs w:val="0"/>
-          <w:smallCaps w:val="0"/>
-          <w:strike w:val="0"/>
-          <w:color w:val="000000"/>
-          <w:sz w:val="20"/>
-          <w:szCs w:val="20"/>
-          <w:u w:val="none"/>
-          <w:shd w:fill="auto" w:val="clear"/>
-          <w:vertAlign w:val="baseline"/>
-        </w:rPr>
-      </w:pPr>
-      <w:r>
-        <w:rPr>
-          <w:rFonts w:ascii="Arial" w:cs="Arial" w:eastAsia="Arial" w:hAnsi="Arial"/>
-          <w:b w:val="1"/>
-          <w:bCs w:val="1"/>
-          <w:sz w:val="20"/>
-          <w:szCs w:val="20"/>
-          <w:rtl w:val="0"/>
-        </w:rPr>
-        <w:t xml:space="preserve">Crop Importance in Emerging Societies and Modern Crop Production</w:t>
-      </w:r>
-      <w:r>
-        <w:rPr>
-          <w:rtl w:val="0"/>
-        </w:rPr>
       </w:r>
     </w:p>
     <w:p>

</xml_diff>

<commit_message>
CV in Spanish sent to Axpe after rewrite petition
</commit_message>
<xml_diff>
--- a/WilliamHolt_CV.docx
+++ b/WilliamHolt_CV.docx
@@ -645,6 +645,12 @@
       </w:pPr>
       <w:r>
         <w:rPr>
+          <w:rtl w:val="0"/>
+        </w:rPr>
+        <w:t xml:space="preserve">Participated in</w:t>
+      </w:r>
+      <w:r>
+        <w:rPr>
           <w:rFonts w:ascii="Arial" w:cs="Arial" w:eastAsia="Arial" w:hAnsi="Arial"/>
           <w:b w:val="0"/>
           <w:bCs w:val="0"/>
@@ -660,7 +666,7 @@
           <w:vertAlign w:val="baseline"/>
           <w:rtl w:val="0"/>
         </w:rPr>
-        <w:t xml:space="preserve">L migration of Qlik dashboards to Tableau by documenting existing logic, enabling a streamlined and consistent transition process.</w:t>
+        <w:t xml:space="preserve"> migration of Qlik dashboards to Tableau by documenting existing logic, enabling a streamlined and consistent transition process.</w:t>
       </w:r>
       <w:r>
         <w:rPr>

</xml_diff>